<commit_message>
Add Elsevier CAS LaTeX manuscript build
</commit_message>
<xml_diff>
--- a/manuscript/ESWA_Manuscript.docx
+++ b/manuscript/ESWA_Manuscript.docx
@@ -6560,13 +6560,13 @@
       </w:r>
     </w:p>
     <w:bookmarkEnd w:id="47"/>
-    <w:bookmarkStart w:id="48" w:name="data-code-and-generative-ai-use"/>
+    <w:bookmarkStart w:id="48" w:name="data-and-code-availability"/>
     <w:p>
       <w:pPr>
         <w:pStyle w:val="Heading1"/>
       </w:pPr>
       <w:r>
-        <w:t xml:space="preserve">Data, code and generative AI use</w:t>
+        <w:t xml:space="preserve">Data and code availability</w:t>
       </w:r>
     </w:p>
     <w:p>
@@ -6577,22 +6577,14 @@
         <w:t xml:space="preserve">ESA Anomaly Dataset version 2 is available under CC BY 3.0 IGO, with credit to the European Space Agency and benchmark contributors, under the terms specific to the IGO. SMD and its interpretation labels are available from the fixed official repository version; the MIT license specific to the dataset was verified separately from the code license. The replication materials document fixed sources and include annotation reconciliation, record and query specifications, execution scripts, serialized archives, results for each history and query, and verification receipts. They are available at https://github.com/williamjay1/historical-review-finite-retention and archived at https://doi.org/10.5281/zenodo.23646555. Raw datasets are not redistributed; selected original last values of completed windows occur only within the derived high score service records. The original preparation pipeline and its dependencies on frozen fitted outputs are documented. No human participants were recruited.</w:t>
       </w:r>
     </w:p>
+    <w:bookmarkEnd w:id="48"/>
+    <w:bookmarkStart w:id="49" w:name="X1f74eb43af444059c7518034463b6c89b1cacf4"/>
     <w:p>
       <w:pPr>
-        <w:pStyle w:val="BodyText"/>
-      </w:pPr>
-      <w:r>
-        <w:t xml:space="preserve">OpenAI Codex (GPT-5 Codex, accessed 23 October 2026) was used only for limited Python code assistance and English language polishing. The tool supported code checks in Sections 3.4 and 3.5. It also supported language editing in the Abstract, Introduction, Results, and Discussion. The authors validated every suggested code change by rerunning the affected checks against the frozen reference outputs, and validated all edited text against the source records and result tables. No sensitive, proprietary, or human participant data were processed; all inputs were public datasets or derived frozen outputs. All substantive research tasks, including study design, data collection and processing, analysis, interpretation, and manuscript preparation, were performed by the authors. AI did not generate or alter data or determine conclusions, and the authors take full responsibility for the manuscript.</w:t>
-      </w:r>
-    </w:p>
-    <w:bookmarkEnd w:id="48"/>
-    <w:bookmarkStart w:id="49" w:name="references"/>
-    <w:p>
-      <w:pPr>
         <w:pStyle w:val="Heading1"/>
       </w:pPr>
       <w:r>
-        <w:t xml:space="preserve">References</w:t>
+        <w:t xml:space="preserve">Declaration of generative AI and AI-assisted technologies in the manuscript preparation process</w:t>
       </w:r>
     </w:p>
     <w:p>
@@ -6600,15 +6592,25 @@
         <w:pStyle w:val="FirstParagraph"/>
       </w:pPr>
       <w:r>
-        <w:t xml:space="preserve">[1] Grafana Labs, 2026. View alert state history. Grafana documentation. https://grafana.com/docs/grafana/latest/alerting/monitor-status/view-alert-state-history/ (accessed 9 October 2026).</w:t>
+        <w:t xml:space="preserve">During the preparation of this work, the author(s) used OpenAI Codex (GPT-5 Codex) for limited Python code assistance and English language polishing; the tool was used on 23 October 2026 and had no access to research data. The author(s) reviewed and edited the output as needed and take full responsibility for the content of the published article.</w:t>
+      </w:r>
+    </w:p>
+    <w:bookmarkEnd w:id="49"/>
+    <w:bookmarkStart w:id="50" w:name="references"/>
+    <w:p>
+      <w:pPr>
+        <w:pStyle w:val="Heading1"/>
+      </w:pPr>
+      <w:r>
+        <w:t xml:space="preserve">References</w:t>
       </w:r>
     </w:p>
     <w:p>
       <w:pPr>
-        <w:pStyle w:val="BodyText"/>
-      </w:pPr>
-      <w:r>
-        <w:t xml:space="preserve">[2] Prometheus Authors, 2026. Alertmanager. Prometheus documentation. https://prometheus.io/docs/alerting/latest/alertmanager/ (accessed 9 October 2026).</w:t>
+        <w:pStyle w:val="FirstParagraph"/>
+      </w:pPr>
+      <w:r>
+        <w:t xml:space="preserve">[1] Grafana Labs, 2026. View alert state history. Grafana documentation. https://grafana.com/docs/grafana/latest/alerting/monitor-status/view-alert-state-history/ (accessed 9 October 2026).</w:t>
       </w:r>
     </w:p>
     <w:p>
@@ -6616,7 +6618,7 @@
         <w:pStyle w:val="BodyText"/>
       </w:pPr>
       <w:r>
-        <w:t xml:space="preserve">[3] Prometheus Authors, 2026. Storage. Prometheus documentation. https://prometheus.io/docs/prometheus/latest/storage/ (accessed 9 October 2026).</w:t>
+        <w:t xml:space="preserve">[2] Prometheus Authors, 2026. Alertmanager. Prometheus documentation. https://prometheus.io/docs/alerting/latest/alertmanager/ (accessed 9 October 2026).</w:t>
       </w:r>
     </w:p>
     <w:p>
@@ -6624,7 +6626,7 @@
         <w:pStyle w:val="BodyText"/>
       </w:pPr>
       <w:r>
-        <w:t xml:space="preserve">[4] Grafana Labs, 2026. Log retention. Grafana Loki documentation. https://grafana.com/docs/loki/latest/operations/storage/retention/ (accessed 9 October 2026).</w:t>
+        <w:t xml:space="preserve">[3] Prometheus Authors, 2026. Storage. Prometheus documentation. https://prometheus.io/docs/prometheus/latest/storage/ (accessed 9 October 2026).</w:t>
       </w:r>
     </w:p>
     <w:p>
@@ -6632,7 +6634,7 @@
         <w:pStyle w:val="BodyText"/>
       </w:pPr>
       <w:r>
-        <w:t xml:space="preserve">[5] Razniewski, S., Nutt, W., 2011. Completeness of queries over incomplete databases. Proceedings of the VLDB Endowment 4 (11), 749–760. https://doi.org/10.14778/3402707.3402715.</w:t>
+        <w:t xml:space="preserve">[4] Grafana Labs, 2026. Log retention. Grafana Loki documentation. https://grafana.com/docs/loki/latest/operations/storage/retention/ (accessed 9 October 2026).</w:t>
       </w:r>
     </w:p>
     <w:p>
@@ -6640,7 +6642,7 @@
         <w:pStyle w:val="BodyText"/>
       </w:pPr>
       <w:r>
-        <w:t xml:space="preserve">[6] Libkin, L., 2015. How to define certain answers. Proceedings of the Twenty-Fourth International Joint Conference on Artificial Intelligence, 4282–4288. https://www.ijcai.org/Proceedings/15/Papers/609.pdf.</w:t>
+        <w:t xml:space="preserve">[5] Razniewski, S., Nutt, W., 2011. Completeness of queries over incomplete databases. Proceedings of the VLDB Endowment 4 (11), 749–760. https://doi.org/10.14778/3402707.3402715.</w:t>
       </w:r>
     </w:p>
     <w:p>
@@ -6648,7 +6650,7 @@
         <w:pStyle w:val="BodyText"/>
       </w:pPr>
       <w:r>
-        <w:t xml:space="preserve">[7] Strem, N., Dhami, D.S., Schmidt, B., Klöpper, B., Kersting, K., 2025. APT: Alarm Prediction Transformer. Expert Systems with Applications 261, 125521. https://doi.org/10.1016/j.eswa.2024.125521.</w:t>
+        <w:t xml:space="preserve">[6] Libkin, L., 2015. How to define certain answers. Proceedings of the Twenty-Fourth International Joint Conference on Artificial Intelligence, 4282–4288. https://www.ijcai.org/Proceedings/15/Papers/609.pdf.</w:t>
       </w:r>
     </w:p>
     <w:p>
@@ -6656,7 +6658,7 @@
         <w:pStyle w:val="BodyText"/>
       </w:pPr>
       <w:r>
-        <w:t xml:space="preserve">[8] Mejri, N., Lopez-Fuentes, L., Roy, K., Chernakov, P., Ghorbel, E., Aouada, D., 2024. Unsupervised anomaly detection in time-series: An extensive evaluation and analysis of state-of-the-art methods. Expert Systems with Applications 256, 124922. https://doi.org/10.1016/j.eswa.2024.124922.</w:t>
+        <w:t xml:space="preserve">[7] Strem, N., Dhami, D.S., Schmidt, B., Klöpper, B., Kersting, K., 2025. APT: Alarm Prediction Transformer. Expert Systems with Applications 261, 125521. https://doi.org/10.1016/j.eswa.2024.125521.</w:t>
       </w:r>
     </w:p>
     <w:p>
@@ -6664,7 +6666,7 @@
         <w:pStyle w:val="BodyText"/>
       </w:pPr>
       <w:r>
-        <w:t xml:space="preserve">[9] Jugel, U., Jerzak, Z., Hackenbroich, G., Markl, V., 2014. M4: A Visualization-Oriented Time Series Data Aggregation. Proceedings of the VLDB Endowment 7 (10), 797–808. https://doi.org/10.14778/2732951.2732953.</w:t>
+        <w:t xml:space="preserve">[8] Mejri, N., Lopez-Fuentes, L., Roy, K., Chernakov, P., Ghorbel, E., Aouada, D., 2024. Unsupervised anomaly detection in time-series: An extensive evaluation and analysis of state-of-the-art methods. Expert Systems with Applications 256, 124922. https://doi.org/10.1016/j.eswa.2024.124922.</w:t>
       </w:r>
     </w:p>
     <w:p>
@@ -6672,7 +6674,7 @@
         <w:pStyle w:val="BodyText"/>
       </w:pPr>
       <w:r>
-        <w:t xml:space="preserve">[10] Jensen, S.K., Pedersen, T.B., Thomsen, C., 2018. ModelarDB: Modular Model-Based Time Series Management with Spark and Cassandra. Proceedings of the VLDB Endowment 11 (11), 1688–1701. https://doi.org/10.14778/3236187.3236215.</w:t>
+        <w:t xml:space="preserve">[9] Jugel, U., Jerzak, Z., Hackenbroich, G., Markl, V., 2014. M4: A Visualization-Oriented Time Series Data Aggregation. Proceedings of the VLDB Endowment 7 (10), 797–808. https://doi.org/10.14778/2732951.2732953.</w:t>
       </w:r>
     </w:p>
     <w:p>
@@ -6680,7 +6682,7 @@
         <w:pStyle w:val="BodyText"/>
       </w:pPr>
       <w:r>
-        <w:t xml:space="preserve">[11] Tang, Y., Zhang, F., Guan, J., Tian, Y., Huang, X., Wang, C., Wang, J., Du, X., 2025. Improving Time Series Data Compression in Apache IoTDB. Proceedings of the VLDB Endowment 18 (10), 3406–3420. https://doi.org/10.14778/3748191.3748204.</w:t>
+        <w:t xml:space="preserve">[10] Jensen, S.K., Pedersen, T.B., Thomsen, C., 2018. ModelarDB: Modular Model-Based Time Series Management with Spark and Cassandra. Proceedings of the VLDB Endowment 11 (11), 1688–1701. https://doi.org/10.14778/3236187.3236215.</w:t>
       </w:r>
     </w:p>
     <w:p>
@@ -6688,7 +6690,7 @@
         <w:pStyle w:val="BodyText"/>
       </w:pPr>
       <w:r>
-        <w:t xml:space="preserve">[12] Van Der Donckt, J., Van Der Donckt, J., Rademaker, M., Van Hoecke, S., 2023. MinMaxLTTB: Leveraging MinMax-Preselection to Scale LTTB. 2023 IEEE Visualization and Visual Analytics (VIS), 21–25. https://doi.org/10.1109/VIS54172.2023.00013.</w:t>
+        <w:t xml:space="preserve">[11] Tang, Y., Zhang, F., Guan, J., Tian, Y., Huang, X., Wang, C., Wang, J., Du, X., 2025. Improving Time Series Data Compression in Apache IoTDB. Proceedings of the VLDB Endowment 18 (10), 3406–3420. https://doi.org/10.14778/3748191.3748204.</w:t>
       </w:r>
     </w:p>
     <w:p>
@@ -6696,7 +6698,7 @@
         <w:pStyle w:val="BodyText"/>
       </w:pPr>
       <w:r>
-        <w:t xml:space="preserve">[13] Pelkonen, T., Franklin, S., Teller, J., Cavallaro, P., Huang, Q., Meza, J., Veeraraghavan, K., 2015. Gorilla: A Fast, Scalable, In-Memory Time Series Database. Proceedings of the VLDB Endowment 8 (12), 1816–1827. https://doi.org/10.14778/2824032.2824078.</w:t>
+        <w:t xml:space="preserve">[12] Van Der Donckt, J., Van Der Donckt, J., Rademaker, M., Van Hoecke, S., 2023. MinMaxLTTB: Leveraging MinMax-Preselection to Scale LTTB. 2023 IEEE Visualization and Visual Analytics (VIS), 21–25. https://doi.org/10.1109/VIS54172.2023.00013.</w:t>
       </w:r>
     </w:p>
     <w:p>
@@ -6704,7 +6706,7 @@
         <w:pStyle w:val="BodyText"/>
       </w:pPr>
       <w:r>
-        <w:t xml:space="preserve">[14] Liakos, P., Papakonstantinopoulou, K., Kotidis, Y., 2022. Chimp: Efficient Lossless Floating Point Compression for Time Series Databases. Proceedings of the VLDB Endowment 15 (11), 3058–3070. https://doi.org/10.14778/3551793.3551852.</w:t>
+        <w:t xml:space="preserve">[13] Pelkonen, T., Franklin, S., Teller, J., Cavallaro, P., Huang, Q., Meza, J., Veeraraghavan, K., 2015. Gorilla: A Fast, Scalable, In-Memory Time Series Database. Proceedings of the VLDB Endowment 8 (12), 1816–1827. https://doi.org/10.14778/2824032.2824078.</w:t>
       </w:r>
     </w:p>
     <w:p>
@@ -6712,7 +6714,7 @@
         <w:pStyle w:val="BodyText"/>
       </w:pPr>
       <w:r>
-        <w:t xml:space="preserve">[15] Li, R., Chen, Z., Lu, R., Xu, X., Yang, G., Chen, C., Bao, J., Zheng, Y., 2025. Serf: Streaming Error-Bounded Floating-Point Compression. Proceedings of the ACM on Management of Data 3 (3), 1–27. https://doi.org/10.1145/3725353.</w:t>
+        <w:t xml:space="preserve">[14] Liakos, P., Papakonstantinopoulou, K., Kotidis, Y., 2022. Chimp: Efficient Lossless Floating Point Compression for Time Series Databases. Proceedings of the VLDB Endowment 15 (11), 3058–3070. https://doi.org/10.14778/3551793.3551852.</w:t>
       </w:r>
     </w:p>
     <w:p>
@@ -6720,7 +6722,7 @@
         <w:pStyle w:val="BodyText"/>
       </w:pPr>
       <w:r>
-        <w:t xml:space="preserve">[16] Su, Y., Zhao, Y., Niu, C., Liu, R., Sun, W., Pei, D., 2019. Robust Anomaly Detection for Multivariate Time Series through Stochastic Recurrent Neural Network. Proceedings of the 25th ACM SIGKDD International Conference on Knowledge Discovery and Data Mining, 2828–2837. https://doi.org/10.1145/3292500.3330672.</w:t>
+        <w:t xml:space="preserve">[15] Li, R., Chen, Z., Lu, R., Xu, X., Yang, G., Chen, C., Bao, J., Zheng, Y., 2025. Serf: Streaming Error-Bounded Floating-Point Compression. Proceedings of the ACM on Management of Data 3 (3), 1–27. https://doi.org/10.1145/3725353.</w:t>
       </w:r>
     </w:p>
     <w:p>
@@ -6728,7 +6730,7 @@
         <w:pStyle w:val="BodyText"/>
       </w:pPr>
       <w:r>
-        <w:t xml:space="preserve">[17] De Canio, G., Kotowski, K., Haskamp, C., 2025. ESA Anomaly Dataset. Version 2. European Space Agency. https://doi.org/10.5281/zenodo.15237121.</w:t>
+        <w:t xml:space="preserve">[16] Su, Y., Zhao, Y., Niu, C., Liu, R., Sun, W., Pei, D., 2019. Robust Anomaly Detection for Multivariate Time Series through Stochastic Recurrent Neural Network. Proceedings of the 25th ACM SIGKDD International Conference on Knowledge Discovery and Data Mining, 2828–2837. https://doi.org/10.1145/3292500.3330672.</w:t>
       </w:r>
     </w:p>
     <w:p>
@@ -6736,7 +6738,7 @@
         <w:pStyle w:val="BodyText"/>
       </w:pPr>
       <w:r>
-        <w:t xml:space="preserve">[18] Kotowski, K., Haskamp, C., Andrzejewski, J., Ruszczak, B., Nalepa, J., Lakey, D., Collins, P., Martínez-Heras, J., De Canio, G., 2026. European Space Agency Dataset and Benchmark for Real-World Anomaly Detection in Spacecraft Time Series. Journal of Data-centric Machine Learning Research 3 (23), 1–76. https://data.mlr.press/assets/pdf/v03-23.pdf.</w:t>
+        <w:t xml:space="preserve">[17] De Canio, G., Kotowski, K., Haskamp, C., 2025. ESA Anomaly Dataset. Version 2. European Space Agency. https://doi.org/10.5281/zenodo.15237121.</w:t>
       </w:r>
     </w:p>
     <w:p>
@@ -6744,7 +6746,7 @@
         <w:pStyle w:val="BodyText"/>
       </w:pPr>
       <w:r>
-        <w:t xml:space="preserve">[19] Jolliffe, I.T., Cadima, J., 2016. Principal component analysis: A review and recent developments. Philosophical Transactions of the Royal Society A: Mathematical, Physical and Engineering Sciences 374 (2065), 20150202. https://doi.org/10.1098/rsta.2015.0202.</w:t>
+        <w:t xml:space="preserve">[18] Kotowski, K., Haskamp, C., Andrzejewski, J., Ruszczak, B., Nalepa, J., Lakey, D., Collins, P., Martínez-Heras, J., De Canio, G., 2026. European Space Agency Dataset and Benchmark for Real-World Anomaly Detection in Spacecraft Time Series. Journal of Data-centric Machine Learning Research 3 (23), 1–76. https://data.mlr.press/assets/pdf/v03-23.pdf.</w:t>
       </w:r>
     </w:p>
     <w:p>
@@ -6752,10 +6754,18 @@
         <w:pStyle w:val="BodyText"/>
       </w:pPr>
       <w:r>
+        <w:t xml:space="preserve">[19] Jolliffe, I.T., Cadima, J., 2016. Principal component analysis: A review and recent developments. Philosophical Transactions of the Royal Society A: Mathematical, Physical and Engineering Sciences 374 (2065), 20150202. https://doi.org/10.1098/rsta.2015.0202.</w:t>
+      </w:r>
+    </w:p>
+    <w:p>
+      <w:pPr>
+        <w:pStyle w:val="BodyText"/>
+      </w:pPr>
+      <w:r>
         <w:t xml:space="preserve">[20] Hoerl, A.E., Kennard, R.W., 1970. Ridge Regression: Biased Estimation for Nonorthogonal Problems. Technometrics 12 (1), 55–67. https://doi.org/10.1080/00401706.1970.10488634.</w:t>
       </w:r>
     </w:p>
-    <w:bookmarkEnd w:id="49"/>
+    <w:bookmarkEnd w:id="50"/>
     <w:sectPr>
       <w:footerReference r:id="rId9" w:type="default"/>
       <w:pgSz w:h="16838" w:w="11906"/>

</xml_diff>